<commit_message>
Update storefront product details and wallet flows
</commit_message>
<xml_diff>
--- a/BAO_CAO_DU_AN.docx
+++ b/BAO_CAO_DU_AN.docx
@@ -101,7 +101,7 @@
           <w:sz w:val="22"/>
           <w:szCs w:val="22"/>
         </w:rPr>
-        <w:t xml:space="preserve">Công nghệ sử dụng: PHP · MySQL · React.js · Tailwind CSS</w:t>
+        <w:t xml:space="preserve">Công nghệ sử dụng: PHP · MySQL · React.js · Tailwind CSS · Python Django AI service</w:t>
       </w:r>
     </w:p>
     <w:p>
@@ -522,7 +522,7 @@
           <w:sz w:val="24"/>
           <w:szCs w:val="24"/>
         </w:rPr>
-        <w:t xml:space="preserve">Triển khai các tính năng cốt lõi: quản lý sản phẩm, đặt hàng, thanh toán, ví điện tử, mã giảm giá, đánh giá sản phẩm.</w:t>
+        <w:t xml:space="preserve">Triển khai các tính năng cốt lõi: quản lý sản phẩm, đặt hàng, thanh toán, ví điện tử, mã giảm giá, đánh giá sản phẩm và gợi ý sách bằng AI service.</w:t>
       </w:r>
     </w:p>
     <w:p>
@@ -622,7 +622,25 @@
           <w:sz w:val="24"/>
           <w:szCs w:val="24"/>
         </w:rPr>
-        <w:t xml:space="preserve">Backend API: REST API PHP thuần tại cổng 5000, phục vụ cả hai giao diện trên.</w:t>
+        <w:t xml:space="preserve">Backend API: REST API PHP thuần tại cổng 5000, phục vụ nghiệp vụ chính cho cả hai giao diện trên.</w:t>
+      </w:r>
+    </w:p>
+    <w:p>
+      <w:pPr>
+        <w:pStyle w:val="ListParagraph"/>
+        <w:numPr>
+          <w:ilvl w:val="0"/>
+          <w:numId w:val="1"/>
+        </w:numPr>
+        <w:spacing w:after="40" w:before="40"/>
+      </w:pPr>
+      <w:r>
+        <w:rPr>
+          <w:rFonts w:ascii="Times New Roman" w:cs="Times New Roman" w:eastAsia="Times New Roman" w:hAnsi="Times New Roman"/>
+          <w:sz w:val="24"/>
+          <w:szCs w:val="24"/>
+        </w:rPr>
+        <w:t xml:space="preserve">Python AI service: Django API tại cổng 8000, phục vụ gợi ý sách, FAQ, thống kê doanh thu và top sản phẩm bán chạy.</w:t>
       </w:r>
     </w:p>
     <w:p>
@@ -827,7 +845,7 @@
           <w:sz w:val="24"/>
           <w:szCs w:val="24"/>
         </w:rPr>
-        <w:t xml:space="preserve">Hỗ trợ nhiều phương thức thanh toán: COD, thẻ, ví điện tử VNPay, Momo, ZaloPay.</w:t>
+        <w:t xml:space="preserve">Hỗ trợ nhiều phương thức thanh toán: COD, thẻ, ví điện tử và các cổng thanh toán như VNPay, Momo, ZaloPay.</w:t>
       </w:r>
     </w:p>
     <w:p>
@@ -2835,7 +2853,25 @@
           <w:sz w:val="24"/>
           <w:szCs w:val="24"/>
         </w:rPr>
-        <w:t xml:space="preserve">Admin panel thống kê doanh thu, quản lý đơn hàng, đổi trả, ví điện tử và thông báo vận hành.</w:t>
+        <w:t xml:space="preserve">Admin panel thống kê doanh thu, tồn kho, quản lý đơn hàng, đổi trả, ví điện tử và thông báo vận hành.</w:t>
+      </w:r>
+    </w:p>
+    <w:p>
+      <w:pPr>
+        <w:pStyle w:val="ListParagraph"/>
+        <w:numPr>
+          <w:ilvl w:val="0"/>
+          <w:numId w:val="1"/>
+        </w:numPr>
+        <w:spacing w:after="40" w:before="40"/>
+      </w:pPr>
+      <w:r>
+        <w:rPr>
+          <w:rFonts w:ascii="Times New Roman" w:cs="Times New Roman" w:eastAsia="Times New Roman" w:hAnsi="Times New Roman"/>
+          <w:sz w:val="24"/>
+          <w:szCs w:val="24"/>
+        </w:rPr>
+        <w:t xml:space="preserve">Python AI service hỗ trợ gợi ý sách, FAQ động, phân tích doanh thu và thống kê top sản phẩm bán chạy.</w:t>
       </w:r>
     </w:p>
     <w:p>
@@ -3482,15 +3518,15 @@
           <w:sz w:val="24"/>
           <w:szCs w:val="24"/>
         </w:rPr>
-        <w:t xml:space="preserve">SPA + REST API</w:t>
-      </w:r>
-      <w:r>
-        <w:rPr>
-          <w:rFonts w:ascii="Times New Roman" w:cs="Times New Roman" w:eastAsia="Times New Roman" w:hAnsi="Times New Roman"/>
-          <w:sz w:val="24"/>
-          <w:szCs w:val="24"/>
-        </w:rPr>
-        <w:t xml:space="preserve"> (Single Page Application kết hợp với PHP REST API):</w:t>
+        <w:t xml:space="preserve">SPA + REST API + AI service</w:t>
+      </w:r>
+      <w:r>
+        <w:rPr>
+          <w:rFonts w:ascii="Times New Roman" w:cs="Times New Roman" w:eastAsia="Times New Roman" w:hAnsi="Times New Roman"/>
+          <w:sz w:val="24"/>
+          <w:szCs w:val="24"/>
+        </w:rPr>
+        <w:t xml:space="preserve"> (Single Page Application kết hợp PHP REST API cho nghiệp vụ chính và Python Django service cho phân tích/gợi ý):</w:t>
       </w:r>
     </w:p>
     <w:p>
@@ -4140,6 +4176,86 @@
                 <w:sz w:val="22"/>
                 <w:szCs w:val="22"/>
               </w:rPr>
+              <w:t xml:space="preserve">AI / Analytics service</w:t>
+            </w:r>
+          </w:p>
+        </w:tc>
+        <w:tc>
+          <w:tcPr>
+            <w:tcMar>
+              <w:top w:type="dxa" w:w="60"/>
+              <w:left w:type="dxa" w:w="120"/>
+              <w:bottom w:type="dxa" w:w="60"/>
+              <w:right w:type="dxa" w:w="120"/>
+            </w:tcMar>
+          </w:tcPr>
+          <w:p>
+            <w:pPr>
+              <w:spacing w:after="40" w:before="40"/>
+              <w:jc w:val="left"/>
+            </w:pPr>
+            <w:r>
+              <w:rPr>
+                <w:rFonts w:ascii="Times New Roman" w:cs="Times New Roman" w:eastAsia="Times New Roman" w:hAnsi="Times New Roman"/>
+                <w:b w:val="false"/>
+                <w:bCs w:val="false"/>
+                <w:sz w:val="22"/>
+                <w:szCs w:val="22"/>
+              </w:rPr>
+              <w:t xml:space="preserve">Python Django, Django REST-style JsonResponse</w:t>
+            </w:r>
+          </w:p>
+        </w:tc>
+        <w:tc>
+          <w:tcPr>
+            <w:tcMar>
+              <w:top w:type="dxa" w:w="60"/>
+              <w:left w:type="dxa" w:w="120"/>
+              <w:bottom w:type="dxa" w:w="60"/>
+              <w:right w:type="dxa" w:w="120"/>
+            </w:tcMar>
+          </w:tcPr>
+          <w:p>
+            <w:pPr>
+              <w:spacing w:after="40" w:before="40"/>
+              <w:jc w:val="left"/>
+            </w:pPr>
+            <w:r>
+              <w:rPr>
+                <w:rFonts w:ascii="Times New Roman" w:cs="Times New Roman" w:eastAsia="Times New Roman" w:hAnsi="Times New Roman"/>
+                <w:b w:val="false"/>
+                <w:bCs w:val="false"/>
+                <w:sz w:val="22"/>
+                <w:szCs w:val="22"/>
+              </w:rPr>
+              <w:t xml:space="preserve">Gợi ý sách, FAQ, phân tích doanh thu và top sản phẩm bán chạy</w:t>
+            </w:r>
+          </w:p>
+        </w:tc>
+      </w:tr>
+      <w:tr>
+        <w:tc>
+          <w:tcPr>
+            <w:tcMar>
+              <w:top w:type="dxa" w:w="60"/>
+              <w:left w:type="dxa" w:w="80"/>
+              <w:bottom w:type="dxa" w:w="60"/>
+              <w:right w:type="dxa" w:w="80"/>
+            </w:tcMar>
+          </w:tcPr>
+          <w:p>
+            <w:pPr>
+              <w:spacing w:after="40" w:before="40"/>
+              <w:jc w:val="center"/>
+            </w:pPr>
+            <w:r>
+              <w:rPr>
+                <w:rFonts w:ascii="Times New Roman" w:cs="Times New Roman" w:eastAsia="Times New Roman" w:hAnsi="Times New Roman"/>
+                <w:b w:val="false"/>
+                <w:bCs w:val="false"/>
+                <w:sz w:val="22"/>
+                <w:szCs w:val="22"/>
+              </w:rPr>
               <w:t xml:space="preserve">Database</w:t>
             </w:r>
           </w:p>
@@ -4787,6 +4903,78 @@
           <w:szCs w:val="24"/>
         </w:rPr>
         <w:t xml:space="preserve">src/middleware/ — AuthMiddleware, CorsMiddleware</w:t>
+      </w:r>
+    </w:p>
+    <w:p>
+      <w:pPr>
+        <w:pStyle w:val="ListParagraph"/>
+        <w:numPr>
+          <w:ilvl w:val="0"/>
+          <w:numId w:val="1"/>
+        </w:numPr>
+        <w:spacing w:after="40" w:before="40"/>
+      </w:pPr>
+      <w:r>
+        <w:rPr>
+          <w:rFonts w:ascii="Times New Roman" w:cs="Times New Roman" w:eastAsia="Times New Roman" w:hAnsi="Times New Roman"/>
+          <w:sz w:val="24"/>
+          <w:szCs w:val="24"/>
+        </w:rPr>
+        <w:t xml:space="preserve">book-store-main/book-store-python/ — Python Django AI/analytics service</w:t>
+      </w:r>
+    </w:p>
+    <w:p>
+      <w:pPr>
+        <w:pStyle w:val="ListParagraph"/>
+        <w:numPr>
+          <w:ilvl w:val="1"/>
+          <w:numId w:val="1"/>
+        </w:numPr>
+        <w:spacing w:after="20" w:before="20"/>
+      </w:pPr>
+      <w:r>
+        <w:rPr>
+          <w:rFonts w:ascii="Times New Roman" w:cs="Times New Roman" w:eastAsia="Times New Roman" w:hAnsi="Times New Roman"/>
+          <w:sz w:val="24"/>
+          <w:szCs w:val="24"/>
+        </w:rPr>
+        <w:t xml:space="preserve">api/recommendation_engine.py — gợi ý sách cho người dùng</w:t>
+      </w:r>
+    </w:p>
+    <w:p>
+      <w:pPr>
+        <w:pStyle w:val="ListParagraph"/>
+        <w:numPr>
+          <w:ilvl w:val="1"/>
+          <w:numId w:val="1"/>
+        </w:numPr>
+        <w:spacing w:after="20" w:before="20"/>
+      </w:pPr>
+      <w:r>
+        <w:rPr>
+          <w:rFonts w:ascii="Times New Roman" w:cs="Times New Roman" w:eastAsia="Times New Roman" w:hAnsi="Times New Roman"/>
+          <w:sz w:val="24"/>
+          <w:szCs w:val="24"/>
+        </w:rPr>
+        <w:t xml:space="preserve">api/analytics_engine.py — phân tích doanh thu và top sản phẩm bán chạy</w:t>
+      </w:r>
+    </w:p>
+    <w:p>
+      <w:pPr>
+        <w:pStyle w:val="ListParagraph"/>
+        <w:numPr>
+          <w:ilvl w:val="1"/>
+          <w:numId w:val="1"/>
+        </w:numPr>
+        <w:spacing w:after="20" w:before="20"/>
+      </w:pPr>
+      <w:r>
+        <w:rPr>
+          <w:rFonts w:ascii="Times New Roman" w:cs="Times New Roman" w:eastAsia="Times New Roman" w:hAnsi="Times New Roman"/>
+          <w:sz w:val="24"/>
+          <w:szCs w:val="24"/>
+        </w:rPr>
+        <w:t xml:space="preserve">api/support_engine.py — dữ liệu FAQ động cho người dùng</w:t>
       </w:r>
     </w:p>
     <w:p>
@@ -9285,7 +9473,7 @@
           <w:sz w:val="24"/>
           <w:szCs w:val="24"/>
         </w:rPr>
-        <w:t xml:space="preserve">Không có tính năng "Sản phẩm liên quan" được tính toán thông minh (chỉ cùng danh mục).</w:t>
+        <w:t xml:space="preserve">Có khối gợi ý sách cá nhân hóa bằng Python AI service; sản phẩm liên quan ở trang chi tiết vẫn chủ yếu dựa theo danh mục.</w:t>
       </w:r>
     </w:p>
     <w:p>
@@ -9441,7 +9629,25 @@
           <w:sz w:val="24"/>
           <w:szCs w:val="24"/>
         </w:rPr>
-        <w:t xml:space="preserve">Đánh dấu "Nổi bật" (is_featured), "Bán chạy" (is_bestseller).</w:t>
+        <w:t xml:space="preserve">Admin bật/tắt "Đang bán" (is_active) và chọn "Sách nổi bật" (is_featured).</w:t>
+      </w:r>
+    </w:p>
+    <w:p>
+      <w:pPr>
+        <w:pStyle w:val="ListParagraph"/>
+        <w:numPr>
+          <w:ilvl w:val="0"/>
+          <w:numId w:val="1"/>
+        </w:numPr>
+        <w:spacing w:after="40" w:before="40"/>
+      </w:pPr>
+      <w:r>
+        <w:rPr>
+          <w:rFonts w:ascii="Times New Roman" w:cs="Times New Roman" w:eastAsia="Times New Roman" w:hAnsi="Times New Roman"/>
+          <w:sz w:val="24"/>
+          <w:szCs w:val="24"/>
+        </w:rPr>
+        <w:t xml:space="preserve">Nhãn "Sách bán chạy" không cho admin tick thủ công; hệ thống tự xác định theo sales_count và sắp xếp theo doanh số.</w:t>
       </w:r>
     </w:p>
     <w:p>
@@ -10821,25 +11027,61 @@
           <w:sz w:val="24"/>
           <w:szCs w:val="24"/>
         </w:rPr>
-        <w:t xml:space="preserve">Tổng quan: tổng đơn hàng, doanh thu, số khách hàng, tổng sản phẩm.</w:t>
-      </w:r>
-    </w:p>
-    <w:p>
-      <w:pPr>
-        <w:pStyle w:val="ListParagraph"/>
-        <w:numPr>
-          <w:ilvl w:val="0"/>
-          <w:numId w:val="1"/>
-        </w:numPr>
-        <w:spacing w:after="40" w:before="40"/>
-      </w:pPr>
-      <w:r>
-        <w:rPr>
-          <w:rFonts w:ascii="Times New Roman" w:cs="Times New Roman" w:eastAsia="Times New Roman" w:hAnsi="Times New Roman"/>
-          <w:sz w:val="24"/>
-          <w:szCs w:val="24"/>
-        </w:rPr>
-        <w:t xml:space="preserve">Doanh thu theo tháng (biểu đồ cột Recharts).</w:t>
+        <w:t xml:space="preserve">Tổng quan: tổng đơn hàng, doanh thu, số khách hàng, tổng sản phẩm, đơn chờ xử lý và sách sắp hết hàng.</w:t>
+      </w:r>
+    </w:p>
+    <w:p>
+      <w:pPr>
+        <w:pStyle w:val="ListParagraph"/>
+        <w:numPr>
+          <w:ilvl w:val="0"/>
+          <w:numId w:val="1"/>
+        </w:numPr>
+        <w:spacing w:after="40" w:before="40"/>
+      </w:pPr>
+      <w:r>
+        <w:rPr>
+          <w:rFonts w:ascii="Times New Roman" w:cs="Times New Roman" w:eastAsia="Times New Roman" w:hAnsi="Times New Roman"/>
+          <w:sz w:val="24"/>
+          <w:szCs w:val="24"/>
+        </w:rPr>
+        <w:t xml:space="preserve">Biểu đồ doanh thu dùng dữ liệu PHP và có thể ưu tiên dữ liệu phân tích từ Python AI service khi service đang chạy.</w:t>
+      </w:r>
+    </w:p>
+    <w:p>
+      <w:pPr>
+        <w:pStyle w:val="ListParagraph"/>
+        <w:numPr>
+          <w:ilvl w:val="0"/>
+          <w:numId w:val="1"/>
+        </w:numPr>
+        <w:spacing w:after="40" w:before="40"/>
+      </w:pPr>
+      <w:r>
+        <w:rPr>
+          <w:rFonts w:ascii="Times New Roman" w:cs="Times New Roman" w:eastAsia="Times New Roman" w:hAnsi="Times New Roman"/>
+          <w:sz w:val="24"/>
+          <w:szCs w:val="24"/>
+        </w:rPr>
+        <w:t xml:space="preserve">Dashboard có biểu đồ tồn kho theo danh mục/tác giả, giá trị hàng tồn và bảng sản phẩm tồn kho.</w:t>
+      </w:r>
+    </w:p>
+    <w:p>
+      <w:pPr>
+        <w:pStyle w:val="ListParagraph"/>
+        <w:numPr>
+          <w:ilvl w:val="0"/>
+          <w:numId w:val="1"/>
+        </w:numPr>
+        <w:spacing w:after="40" w:before="40"/>
+      </w:pPr>
+      <w:r>
+        <w:rPr>
+          <w:rFonts w:ascii="Times New Roman" w:cs="Times New Roman" w:eastAsia="Times New Roman" w:hAnsi="Times New Roman"/>
+          <w:sz w:val="24"/>
+          <w:szCs w:val="24"/>
+        </w:rPr>
+        <w:t xml:space="preserve">Python AI service cung cấp thống kê doanh thu 30 ngày và top sản phẩm bán chạy.</w:t>
       </w:r>
     </w:p>
     <w:p>
@@ -10927,43 +11169,179 @@
           <w:sz w:val="24"/>
           <w:szCs w:val="24"/>
         </w:rPr>
-        <w:t xml:space="preserve">Không có thống kê sản phẩm bán chạy nhất (top products).</w:t>
-      </w:r>
-    </w:p>
-    <w:p>
-      <w:pPr>
-        <w:pStyle w:val="ListParagraph"/>
-        <w:numPr>
-          <w:ilvl w:val="0"/>
-          <w:numId w:val="1"/>
-        </w:numPr>
-        <w:spacing w:after="40" w:before="40"/>
-      </w:pPr>
-      <w:r>
-        <w:rPr>
-          <w:rFonts w:ascii="Times New Roman" w:cs="Times New Roman" w:eastAsia="Times New Roman" w:hAnsi="Times New Roman"/>
-          <w:sz w:val="24"/>
-          <w:szCs w:val="24"/>
-        </w:rPr>
-        <w:t xml:space="preserve">Không có phân tích hành vi người dùng (funnel, bounce rate).</w:t>
-      </w:r>
-    </w:p>
-    <w:p>
-      <w:pPr>
-        <w:pStyle w:val="ListParagraph"/>
-        <w:numPr>
-          <w:ilvl w:val="0"/>
-          <w:numId w:val="1"/>
-        </w:numPr>
-        <w:spacing w:after="40" w:before="40"/>
-      </w:pPr>
-      <w:r>
-        <w:rPr>
-          <w:rFonts w:ascii="Times New Roman" w:cs="Times New Roman" w:eastAsia="Times New Roman" w:hAnsi="Times New Roman"/>
-          <w:sz w:val="24"/>
-          <w:szCs w:val="24"/>
-        </w:rPr>
-        <w:t xml:space="preserve">Chưa có cảnh báo tồn kho thấp (low stock alert).</w:t>
+        <w:t xml:space="preserve">Chưa có phân tích hành vi người dùng nâng cao như funnel, bounce rate hoặc cohort.</w:t>
+      </w:r>
+    </w:p>
+    <w:p>
+      <w:pPr>
+        <w:pStyle w:val="ListParagraph"/>
+        <w:numPr>
+          <w:ilvl w:val="0"/>
+          <w:numId w:val="1"/>
+        </w:numPr>
+        <w:spacing w:after="40" w:before="40"/>
+      </w:pPr>
+      <w:r>
+        <w:rPr>
+          <w:rFonts w:ascii="Times New Roman" w:cs="Times New Roman" w:eastAsia="Times New Roman" w:hAnsi="Times New Roman"/>
+          <w:sz w:val="24"/>
+          <w:szCs w:val="24"/>
+        </w:rPr>
+        <w:t xml:space="preserve">Cảnh báo tồn kho hiện ở mức thống kê trong dashboard, chưa có gửi email/SMS tự động.</w:t>
+      </w:r>
+    </w:p>
+    <w:p>
+      <w:pPr>
+        <w:pStyle w:val="Heading2"/>
+        <w:spacing w:after="120" w:before="260"/>
+        <w:rPr>
+          <w:b/>
+          <w:bCs/>
+          <w:color w:val="1E3A5F"/>
+        </w:rPr>
+      </w:pPr>
+      <w:r>
+        <w:t xml:space="preserve">6.8.1. Nhóm chức năng: Python AI service</w:t>
+      </w:r>
+    </w:p>
+    <w:p>
+      <w:pPr>
+        <w:spacing w:after="80" w:before="60"/>
+        <w:jc w:val="both"/>
+      </w:pPr>
+      <w:r>
+        <w:rPr>
+          <w:rFonts w:ascii="Times New Roman" w:cs="Times New Roman" w:eastAsia="Times New Roman" w:hAnsi="Times New Roman"/>
+          <w:b/>
+          <w:bCs/>
+          <w:sz w:val="24"/>
+          <w:szCs w:val="24"/>
+        </w:rPr>
+        <w:t xml:space="preserve">Tình huống HOÀN THÀNH:</w:t>
+      </w:r>
+    </w:p>
+    <w:p>
+      <w:pPr>
+        <w:pStyle w:val="ListParagraph"/>
+        <w:numPr>
+          <w:ilvl w:val="0"/>
+          <w:numId w:val="1"/>
+        </w:numPr>
+        <w:spacing w:after="40" w:before="40"/>
+      </w:pPr>
+      <w:r>
+        <w:rPr>
+          <w:rFonts w:ascii="Times New Roman" w:cs="Times New Roman" w:eastAsia="Times New Roman" w:hAnsi="Times New Roman"/>
+          <w:sz w:val="24"/>
+          <w:szCs w:val="24"/>
+        </w:rPr>
+        <w:t xml:space="preserve">Gợi ý sách cho người dùng ở trang chủ thông qua endpoint /ai/recommendations/user/.</w:t>
+      </w:r>
+    </w:p>
+    <w:p>
+      <w:pPr>
+        <w:pStyle w:val="ListParagraph"/>
+        <w:numPr>
+          <w:ilvl w:val="0"/>
+          <w:numId w:val="1"/>
+        </w:numPr>
+        <w:spacing w:after="40" w:before="40"/>
+      </w:pPr>
+      <w:r>
+        <w:rPr>
+          <w:rFonts w:ascii="Times New Roman" w:cs="Times New Roman" w:eastAsia="Times New Roman" w:hAnsi="Times New Roman"/>
+          <w:sz w:val="24"/>
+          <w:szCs w:val="24"/>
+        </w:rPr>
+        <w:t xml:space="preserve">Cung cấp FAQ động cho trang Câu hỏi thường gặp thông qua endpoint /ai/support/faq/; frontend có fallback nếu service Python chưa chạy.</w:t>
+      </w:r>
+    </w:p>
+    <w:p>
+      <w:pPr>
+        <w:pStyle w:val="ListParagraph"/>
+        <w:numPr>
+          <w:ilvl w:val="0"/>
+          <w:numId w:val="1"/>
+        </w:numPr>
+        <w:spacing w:after="40" w:before="40"/>
+      </w:pPr>
+      <w:r>
+        <w:rPr>
+          <w:rFonts w:ascii="Times New Roman" w:cs="Times New Roman" w:eastAsia="Times New Roman" w:hAnsi="Times New Roman"/>
+          <w:sz w:val="24"/>
+          <w:szCs w:val="24"/>
+        </w:rPr>
+        <w:t xml:space="preserve">Phân tích doanh thu theo ngày qua endpoint /ai/analytics/overview/.</w:t>
+      </w:r>
+    </w:p>
+    <w:p>
+      <w:pPr>
+        <w:pStyle w:val="ListParagraph"/>
+        <w:numPr>
+          <w:ilvl w:val="0"/>
+          <w:numId w:val="1"/>
+        </w:numPr>
+        <w:spacing w:after="40" w:before="40"/>
+      </w:pPr>
+      <w:r>
+        <w:rPr>
+          <w:rFonts w:ascii="Times New Roman" w:cs="Times New Roman" w:eastAsia="Times New Roman" w:hAnsi="Times New Roman"/>
+          <w:sz w:val="24"/>
+          <w:szCs w:val="24"/>
+        </w:rPr>
+        <w:t xml:space="preserve">Thống kê top sản phẩm bán chạy qua endpoint /ai/analytics/top-products/.</w:t>
+      </w:r>
+    </w:p>
+    <w:p>
+      <w:pPr>
+        <w:spacing w:after="80" w:before="60"/>
+        <w:jc w:val="both"/>
+      </w:pPr>
+      <w:r>
+        <w:rPr>
+          <w:rFonts w:ascii="Times New Roman" w:cs="Times New Roman" w:eastAsia="Times New Roman" w:hAnsi="Times New Roman"/>
+          <w:b/>
+          <w:bCs/>
+          <w:sz w:val="24"/>
+          <w:szCs w:val="24"/>
+        </w:rPr>
+        <w:t xml:space="preserve">Tình huống HẠN CHẾ:</w:t>
+      </w:r>
+    </w:p>
+    <w:p>
+      <w:pPr>
+        <w:pStyle w:val="ListParagraph"/>
+        <w:numPr>
+          <w:ilvl w:val="0"/>
+          <w:numId w:val="1"/>
+        </w:numPr>
+        <w:spacing w:after="40" w:before="40"/>
+      </w:pPr>
+      <w:r>
+        <w:rPr>
+          <w:rFonts w:ascii="Times New Roman" w:cs="Times New Roman" w:eastAsia="Times New Roman" w:hAnsi="Times New Roman"/>
+          <w:sz w:val="24"/>
+          <w:szCs w:val="24"/>
+        </w:rPr>
+        <w:t xml:space="preserve">AI hiện là service phân tích/gợi ý mức cơ bản dựa trên dữ liệu đơn hàng, sản phẩm và danh mục; chưa huấn luyện mô hình machine learning phức tạp.</w:t>
+      </w:r>
+    </w:p>
+    <w:p>
+      <w:pPr>
+        <w:pStyle w:val="ListParagraph"/>
+        <w:numPr>
+          <w:ilvl w:val="0"/>
+          <w:numId w:val="1"/>
+        </w:numPr>
+        <w:spacing w:after="40" w:before="40"/>
+      </w:pPr>
+      <w:r>
+        <w:rPr>
+          <w:rFonts w:ascii="Times New Roman" w:cs="Times New Roman" w:eastAsia="Times New Roman" w:hAnsi="Times New Roman"/>
+          <w:sz w:val="24"/>
+          <w:szCs w:val="24"/>
+        </w:rPr>
+        <w:t xml:space="preserve">Cần chạy riêng Django service tại cổng 8000; nếu service chưa chạy thì frontend/admin dùng dữ liệu PHP hoặc fallback.</w:t>
       </w:r>
     </w:p>
     <w:p>
@@ -12510,33 +12888,113 @@
                 <w:sz w:val="22"/>
                 <w:szCs w:val="22"/>
               </w:rPr>
-              <w:t xml:space="preserve">✅ ~80%</w:t>
-            </w:r>
-          </w:p>
-        </w:tc>
-        <w:tc>
-          <w:tcPr>
-            <w:tcMar>
-              <w:top w:type="dxa" w:w="60"/>
-              <w:left w:type="dxa" w:w="120"/>
-              <w:bottom w:type="dxa" w:w="60"/>
-              <w:right w:type="dxa" w:w="120"/>
-            </w:tcMar>
-          </w:tcPr>
-          <w:p>
-            <w:pPr>
-              <w:spacing w:after="40" w:before="40"/>
-              <w:jc w:val="left"/>
-            </w:pPr>
-            <w:r>
-              <w:rPr>
-                <w:rFonts w:ascii="Times New Roman" w:cs="Times New Roman" w:eastAsia="Times New Roman" w:hAnsi="Times New Roman"/>
-                <w:b w:val="false"/>
-                <w:bCs w:val="false"/>
-                <w:sz w:val="22"/>
-                <w:szCs w:val="22"/>
-              </w:rPr>
-              <w:t xml:space="preserve">Thiếu top-products, low stock alert</w:t>
+              <w:t xml:space="preserve">✅ ~88%</w:t>
+            </w:r>
+          </w:p>
+        </w:tc>
+        <w:tc>
+          <w:tcPr>
+            <w:tcMar>
+              <w:top w:type="dxa" w:w="60"/>
+              <w:left w:type="dxa" w:w="120"/>
+              <w:bottom w:type="dxa" w:w="60"/>
+              <w:right w:type="dxa" w:w="120"/>
+            </w:tcMar>
+          </w:tcPr>
+          <w:p>
+            <w:pPr>
+              <w:spacing w:after="40" w:before="40"/>
+              <w:jc w:val="left"/>
+            </w:pPr>
+            <w:r>
+              <w:rPr>
+                <w:rFonts w:ascii="Times New Roman" w:cs="Times New Roman" w:eastAsia="Times New Roman" w:hAnsi="Times New Roman"/>
+                <w:b w:val="false"/>
+                <w:bCs w:val="false"/>
+                <w:sz w:val="22"/>
+                <w:szCs w:val="22"/>
+              </w:rPr>
+              <w:t xml:space="preserve">Có doanh thu, tồn kho, biểu đồ Recharts và dữ liệu AI analytics khi Python service chạy</w:t>
+            </w:r>
+          </w:p>
+        </w:tc>
+      </w:tr>
+      <w:tr>
+        <w:tc>
+          <w:tcPr>
+            <w:tcMar>
+              <w:top w:type="dxa" w:w="60"/>
+              <w:left w:type="dxa" w:w="80"/>
+              <w:bottom w:type="dxa" w:w="60"/>
+              <w:right w:type="dxa" w:w="80"/>
+            </w:tcMar>
+          </w:tcPr>
+          <w:p>
+            <w:pPr>
+              <w:spacing w:after="40" w:before="40"/>
+              <w:jc w:val="center"/>
+            </w:pPr>
+            <w:r>
+              <w:rPr>
+                <w:rFonts w:ascii="Times New Roman" w:cs="Times New Roman" w:eastAsia="Times New Roman" w:hAnsi="Times New Roman"/>
+                <w:b w:val="false"/>
+                <w:bCs w:val="false"/>
+                <w:sz w:val="22"/>
+                <w:szCs w:val="22"/>
+              </w:rPr>
+              <w:t xml:space="preserve">Python AI service</w:t>
+            </w:r>
+          </w:p>
+        </w:tc>
+        <w:tc>
+          <w:tcPr>
+            <w:tcMar>
+              <w:top w:type="dxa" w:w="60"/>
+              <w:left w:type="dxa" w:w="120"/>
+              <w:bottom w:type="dxa" w:w="60"/>
+              <w:right w:type="dxa" w:w="120"/>
+            </w:tcMar>
+          </w:tcPr>
+          <w:p>
+            <w:pPr>
+              <w:spacing w:after="40" w:before="40"/>
+              <w:jc w:val="left"/>
+            </w:pPr>
+            <w:r>
+              <w:rPr>
+                <w:rFonts w:ascii="Times New Roman" w:cs="Times New Roman" w:eastAsia="Times New Roman" w:hAnsi="Times New Roman"/>
+                <w:b w:val="false"/>
+                <w:bCs w:val="false"/>
+                <w:sz w:val="22"/>
+                <w:szCs w:val="22"/>
+              </w:rPr>
+              <w:t xml:space="preserve">✅ ~75%</w:t>
+            </w:r>
+          </w:p>
+        </w:tc>
+        <w:tc>
+          <w:tcPr>
+            <w:tcMar>
+              <w:top w:type="dxa" w:w="60"/>
+              <w:left w:type="dxa" w:w="120"/>
+              <w:bottom w:type="dxa" w:w="60"/>
+              <w:right w:type="dxa" w:w="120"/>
+            </w:tcMar>
+          </w:tcPr>
+          <w:p>
+            <w:pPr>
+              <w:spacing w:after="40" w:before="40"/>
+              <w:jc w:val="left"/>
+            </w:pPr>
+            <w:r>
+              <w:rPr>
+                <w:rFonts w:ascii="Times New Roman" w:cs="Times New Roman" w:eastAsia="Times New Roman" w:hAnsi="Times New Roman"/>
+                <w:b w:val="false"/>
+                <w:bCs w:val="false"/>
+                <w:sz w:val="22"/>
+                <w:szCs w:val="22"/>
+              </w:rPr>
+              <w:t xml:space="preserve">Có gợi ý sách, FAQ, doanh thu 30 ngày và top sản phẩm; chưa có ML nâng cao</w:t>
             </w:r>
           </w:p>
         </w:tc>
@@ -13081,6 +13539,24 @@
           <w:sz w:val="24"/>
           <w:szCs w:val="24"/>
         </w:rPr>
+        <w:t xml:space="preserve">Bổ sung Python Django AI service cho gợi ý sách, FAQ động, phân tích doanh thu và thống kê top sản phẩm bán chạy.</w:t>
+      </w:r>
+    </w:p>
+    <w:p>
+      <w:pPr>
+        <w:pStyle w:val="ListParagraph"/>
+        <w:numPr>
+          <w:ilvl w:val="0"/>
+          <w:numId w:val="1"/>
+        </w:numPr>
+        <w:spacing w:after="40" w:before="40"/>
+      </w:pPr>
+      <w:r>
+        <w:rPr>
+          <w:rFonts w:ascii="Times New Roman" w:cs="Times New Roman" w:eastAsia="Times New Roman" w:hAnsi="Times New Roman"/>
+          <w:sz w:val="24"/>
+          <w:szCs w:val="24"/>
+        </w:rPr>
         <w:t xml:space="preserve">Hệ thống coupon linh hoạt với nhiều loại điều kiện.</w:t>
       </w:r>
     </w:p>
@@ -13239,6 +13715,24 @@
           <w:sz w:val="24"/>
           <w:szCs w:val="24"/>
         </w:rPr>
+        <w:t xml:space="preserve">AI service hiện ở mức phân tích/gợi ý cơ bản, chưa có mô hình học máy nâng cao hoặc huấn luyện từ hành vi dài hạn.</w:t>
+      </w:r>
+    </w:p>
+    <w:p>
+      <w:pPr>
+        <w:pStyle w:val="ListParagraph"/>
+        <w:numPr>
+          <w:ilvl w:val="0"/>
+          <w:numId w:val="1"/>
+        </w:numPr>
+        <w:spacing w:after="40" w:before="40"/>
+      </w:pPr>
+      <w:r>
+        <w:rPr>
+          <w:rFonts w:ascii="Times New Roman" w:cs="Times New Roman" w:eastAsia="Times New Roman" w:hAnsi="Times New Roman"/>
+          <w:sz w:val="24"/>
+          <w:szCs w:val="24"/>
+        </w:rPr>
         <w:t xml:space="preserve">Không có CDN hay image optimization — ảnh sản phẩm lớn ảnh hưởng hiệu năng.</w:t>
       </w:r>
     </w:p>
@@ -13415,6 +13909,24 @@
           <w:sz w:val="24"/>
           <w:szCs w:val="24"/>
         </w:rPr>
+        <w:t xml:space="preserve">Nâng cấp AI service: gợi ý theo lịch sử xem/tìm kiếm, phân cụm người dùng, dự báo tồn kho và dự báo doanh thu.</w:t>
+      </w:r>
+    </w:p>
+    <w:p>
+      <w:pPr>
+        <w:pStyle w:val="ListParagraph"/>
+        <w:numPr>
+          <w:ilvl w:val="0"/>
+          <w:numId w:val="1"/>
+        </w:numPr>
+        <w:spacing w:after="40" w:before="40"/>
+      </w:pPr>
+      <w:r>
+        <w:rPr>
+          <w:rFonts w:ascii="Times New Roman" w:cs="Times New Roman" w:eastAsia="Times New Roman" w:hAnsi="Times New Roman"/>
+          <w:sz w:val="24"/>
+          <w:szCs w:val="24"/>
+        </w:rPr>
         <w:t xml:space="preserve">Chuyển backend sang Laravel/Symfony để có ORM, queue, cache đầy đủ hơn.</w:t>
       </w:r>
     </w:p>
@@ -13466,7 +13978,7 @@
           <w:sz w:val="24"/>
           <w:szCs w:val="24"/>
         </w:rPr>
-        <w:t xml:space="preserve">Dự án BookStore đã xây dựng thành công một hệ thống bán sách trực tuyến đầy đủ chức năng, có thể vận hành thực tế ở quy mô nhỏ và vừa. Hệ thống thể hiện khả năng tích hợp nhiều công nghệ hiện đại: React SPA, PHP REST API, MySQL, JWT authentication, và Google OAuth — phản ánh đúng xu hướng phát triển phần mềm web ngày nay.</w:t>
+        <w:t xml:space="preserve">Dự án BookStore đã xây dựng thành công một hệ thống bán sách trực tuyến đầy đủ chức năng, có thể vận hành thực tế ở quy mô nhỏ và vừa. Hệ thống thể hiện khả năng tích hợp nhiều công nghệ hiện đại: React SPA, PHP REST API, Python Django AI service, MySQL, JWT authentication, và Google OAuth — phản ánh đúng xu hướng phát triển phần mềm web ngày nay.</w:t>
       </w:r>
     </w:p>
     <w:p>
@@ -13527,7 +14039,7 @@
           <w:sz w:val="24"/>
           <w:szCs w:val="24"/>
         </w:rPr>
-        <w:t xml:space="preserve">Ngày 22 tháng 5 năm 2026</w:t>
+        <w:t xml:space="preserve">Ngày 25 tháng 5 năm 2026</w:t>
       </w:r>
     </w:p>
     <w:sectPr>

</xml_diff>